<commit_message>
Utolsó hiba javítása Állapot: 100%
</commit_message>
<xml_diff>
--- a/OkostoltoRendszer/Documents/Felhasználói útmutató.docx
+++ b/OkostoltoRendszer/Documents/Felhasználói útmutató.docx
@@ -1,6 +1,6 @@
 
 <file path=word/document.xml><?xml version="1.0" encoding="utf-8"?>
-<w:document xmlns:wpc="http://schemas.microsoft.com/office/word/2010/wordprocessingCanvas" xmlns:cx="http://schemas.microsoft.com/office/drawing/2014/chartex" xmlns:cx1="http://schemas.microsoft.com/office/drawing/2015/9/8/chartex" xmlns:cx2="http://schemas.microsoft.com/office/drawing/2015/10/21/chartex" xmlns:cx3="http://schemas.microsoft.com/office/drawing/2016/5/9/chartex" xmlns:cx4="http://schemas.microsoft.com/office/drawing/2016/5/10/chartex" xmlns:cx5="http://schemas.microsoft.com/office/drawing/2016/5/11/chartex" xmlns:cx6="http://schemas.microsoft.com/office/drawing/2016/5/12/chartex" xmlns:cx7="http://schemas.microsoft.com/office/drawing/2016/5/13/chartex" xmlns:cx8="http://schemas.microsoft.com/office/drawing/2016/5/14/chartex" xmlns:mc="http://schemas.openxmlformats.org/markup-compatibility/2006" xmlns:aink="http://schemas.microsoft.com/office/drawing/2016/ink" xmlns:am3d="http://schemas.microsoft.com/office/drawing/2017/model3d" xmlns:o="urn:schemas-microsoft-com:office:office" xmlns:r="http://schemas.openxmlformats.org/officeDocument/2006/relationships" xmlns:m="http://schemas.openxmlformats.org/officeDocument/2006/math" xmlns:v="urn:schemas-microsoft-com:vml" xmlns:wp14="http://schemas.microsoft.com/office/word/2010/wordprocessingDrawing" xmlns:wp="http://schemas.openxmlformats.org/drawingml/2006/wordprocessingDrawing" xmlns:w10="urn:schemas-microsoft-com:office:word" xmlns:w="http://schemas.openxmlformats.org/wordprocessingml/2006/main" xmlns:w14="http://schemas.microsoft.com/office/word/2010/wordml" xmlns:w15="http://schemas.microsoft.com/office/word/2012/wordml" xmlns:w16cid="http://schemas.microsoft.com/office/word/2016/wordml/cid" xmlns:w16se="http://schemas.microsoft.com/office/word/2015/wordml/symex" xmlns:wpg="http://schemas.microsoft.com/office/word/2010/wordprocessingGroup" xmlns:wpi="http://schemas.microsoft.com/office/word/2010/wordprocessingInk" xmlns:wne="http://schemas.microsoft.com/office/word/2006/wordml" xmlns:wps="http://schemas.microsoft.com/office/word/2010/wordprocessingShape" mc:Ignorable="w14 w15 w16se w16cid wp14">
+<w:document xmlns:wpc="http://schemas.microsoft.com/office/word/2010/wordprocessingCanvas" xmlns:cx="http://schemas.microsoft.com/office/drawing/2014/chartex" xmlns:cx1="http://schemas.microsoft.com/office/drawing/2015/9/8/chartex" xmlns:cx2="http://schemas.microsoft.com/office/drawing/2015/10/21/chartex" xmlns:cx3="http://schemas.microsoft.com/office/drawing/2016/5/9/chartex" xmlns:cx4="http://schemas.microsoft.com/office/drawing/2016/5/10/chartex" xmlns:cx5="http://schemas.microsoft.com/office/drawing/2016/5/11/chartex" xmlns:cx6="http://schemas.microsoft.com/office/drawing/2016/5/12/chartex" xmlns:cx7="http://schemas.microsoft.com/office/drawing/2016/5/13/chartex" xmlns:cx8="http://schemas.microsoft.com/office/drawing/2016/5/14/chartex" xmlns:mc="http://schemas.openxmlformats.org/markup-compatibility/2006" xmlns:aink="http://schemas.microsoft.com/office/drawing/2016/ink" xmlns:am3d="http://schemas.microsoft.com/office/drawing/2017/model3d" xmlns:o="urn:schemas-microsoft-com:office:office" xmlns:oel="http://schemas.microsoft.com/office/2019/extlst" xmlns:r="http://schemas.openxmlformats.org/officeDocument/2006/relationships" xmlns:m="http://schemas.openxmlformats.org/officeDocument/2006/math" xmlns:v="urn:schemas-microsoft-com:vml" xmlns:wp14="http://schemas.microsoft.com/office/word/2010/wordprocessingDrawing" xmlns:wp="http://schemas.openxmlformats.org/drawingml/2006/wordprocessingDrawing" xmlns:w10="urn:schemas-microsoft-com:office:word" xmlns:w="http://schemas.openxmlformats.org/wordprocessingml/2006/main" xmlns:w14="http://schemas.microsoft.com/office/word/2010/wordml" xmlns:w15="http://schemas.microsoft.com/office/word/2012/wordml" xmlns:w16cex="http://schemas.microsoft.com/office/word/2018/wordml/cex" xmlns:w16cid="http://schemas.microsoft.com/office/word/2016/wordml/cid" xmlns:w16="http://schemas.microsoft.com/office/word/2018/wordml" xmlns:w16du="http://schemas.microsoft.com/office/word/2023/wordml/word16du" xmlns:w16sdtdh="http://schemas.microsoft.com/office/word/2020/wordml/sdtdatahash" xmlns:w16sdtfl="http://schemas.microsoft.com/office/word/2024/wordml/sdtformatlock" xmlns:w16se="http://schemas.microsoft.com/office/word/2015/wordml/symex" xmlns:wpg="http://schemas.microsoft.com/office/word/2010/wordprocessingGroup" xmlns:wpi="http://schemas.microsoft.com/office/word/2010/wordprocessingInk" xmlns:wne="http://schemas.microsoft.com/office/word/2006/wordml" xmlns:wps="http://schemas.microsoft.com/office/word/2010/wordprocessingShape" mc:Ignorable="w14 w15 w16se w16cid w16 w16cex w16sdtdh w16sdtfl w16du wp14">
   <w:body>
     <w:p>
       <w:pPr>
@@ -317,17 +317,7 @@
           <w:sz w:val="28"/>
           <w:szCs w:val="40"/>
         </w:rPr>
-        <w:t xml:space="preserve">4 </w:t>
-      </w:r>
-      <w:proofErr w:type="spellStart"/>
-      <w:r>
-        <w:rPr>
-          <w:rFonts w:eastAsia="Yu Gothic UI Semibold" w:cstheme="minorHAnsi"/>
-          <w:b/>
-          <w:sz w:val="28"/>
-          <w:szCs w:val="40"/>
-        </w:rPr>
-        <w:t>port</w:t>
+        <w:t>4 port</w:t>
       </w:r>
       <w:r>
         <w:rPr>
@@ -338,7 +328,6 @@
         </w:rPr>
         <w:t>ja</w:t>
       </w:r>
-      <w:proofErr w:type="spellEnd"/>
       <w:r>
         <w:rPr>
           <w:rFonts w:eastAsia="Yu Gothic UI Semibold" w:cstheme="minorHAnsi"/>
@@ -551,17 +540,8 @@
           <w:sz w:val="40"/>
           <w:szCs w:val="40"/>
         </w:rPr>
-        <w:t xml:space="preserve"> </w:t>
-      </w:r>
-      <w:proofErr w:type="spellStart"/>
-      <w:r>
-        <w:rPr>
-          <w:sz w:val="40"/>
-          <w:szCs w:val="40"/>
-        </w:rPr>
-        <w:t>Glossary</w:t>
-      </w:r>
-      <w:proofErr w:type="spellEnd"/>
+        <w:t xml:space="preserve"> Glossary</w:t>
+      </w:r>
     </w:p>
     <w:p>
       <w:pPr>
@@ -778,27 +758,7 @@
           <w:szCs w:val="28"/>
           <w:u w:val="single"/>
         </w:rPr>
-        <w:t>Az autó azonosítója (</w:t>
-      </w:r>
-      <w:proofErr w:type="spellStart"/>
-      <w:r>
-        <w:rPr>
-          <w:b/>
-          <w:sz w:val="28"/>
-          <w:szCs w:val="28"/>
-          <w:u w:val="single"/>
-        </w:rPr>
-        <w:t>id</w:t>
-      </w:r>
-      <w:proofErr w:type="spellEnd"/>
-      <w:r>
-        <w:rPr>
-          <w:b/>
-          <w:sz w:val="28"/>
-          <w:szCs w:val="28"/>
-          <w:u w:val="single"/>
-        </w:rPr>
-        <w:t>)</w:t>
+        <w:t>Az autó azonosítója (id)</w:t>
       </w:r>
     </w:p>
     <w:p>
@@ -874,97 +834,8 @@
           <w:sz w:val="28"/>
           <w:szCs w:val="28"/>
         </w:rPr>
-        <w:t xml:space="preserve">1 - Ultra </w:t>
-      </w:r>
-      <w:proofErr w:type="spellStart"/>
-      <w:r>
-        <w:rPr>
-          <w:sz w:val="28"/>
-          <w:szCs w:val="28"/>
-        </w:rPr>
-        <w:t>Fast</w:t>
-      </w:r>
-      <w:proofErr w:type="spellEnd"/>
-      <w:r>
-        <w:rPr>
-          <w:sz w:val="28"/>
-          <w:szCs w:val="28"/>
-        </w:rPr>
-        <w:t xml:space="preserve">, 2 - </w:t>
-      </w:r>
-      <w:proofErr w:type="spellStart"/>
-      <w:r>
-        <w:rPr>
-          <w:sz w:val="28"/>
-          <w:szCs w:val="28"/>
-        </w:rPr>
-        <w:t>Fast</w:t>
-      </w:r>
-      <w:proofErr w:type="spellEnd"/>
-      <w:r>
-        <w:rPr>
-          <w:sz w:val="28"/>
-          <w:szCs w:val="28"/>
-        </w:rPr>
-        <w:t xml:space="preserve">, 3 - </w:t>
-      </w:r>
-      <w:proofErr w:type="spellStart"/>
-      <w:r>
-        <w:rPr>
-          <w:sz w:val="28"/>
-          <w:szCs w:val="28"/>
-        </w:rPr>
-        <w:t>Fast</w:t>
-      </w:r>
-      <w:proofErr w:type="spellEnd"/>
-      <w:r>
-        <w:rPr>
-          <w:sz w:val="28"/>
-          <w:szCs w:val="28"/>
-        </w:rPr>
-        <w:t xml:space="preserve">, 4 - </w:t>
-      </w:r>
-      <w:proofErr w:type="spellStart"/>
-      <w:r>
-        <w:rPr>
-          <w:sz w:val="28"/>
-          <w:szCs w:val="28"/>
-        </w:rPr>
-        <w:t>Normal</w:t>
-      </w:r>
-      <w:proofErr w:type="spellEnd"/>
-      <w:r>
-        <w:rPr>
-          <w:sz w:val="28"/>
-          <w:szCs w:val="28"/>
-        </w:rPr>
-        <w:t xml:space="preserve">, 5 - </w:t>
-      </w:r>
-      <w:proofErr w:type="spellStart"/>
-      <w:r>
-        <w:rPr>
-          <w:sz w:val="28"/>
-          <w:szCs w:val="28"/>
-        </w:rPr>
-        <w:t>Normal</w:t>
-      </w:r>
-      <w:proofErr w:type="spellEnd"/>
-      <w:r>
-        <w:rPr>
-          <w:sz w:val="28"/>
-          <w:szCs w:val="28"/>
-        </w:rPr>
-        <w:t xml:space="preserve">, 6 - </w:t>
-      </w:r>
-      <w:proofErr w:type="spellStart"/>
-      <w:r>
-        <w:rPr>
-          <w:sz w:val="28"/>
-          <w:szCs w:val="28"/>
-        </w:rPr>
-        <w:t>Slow</w:t>
-      </w:r>
-      <w:proofErr w:type="spellEnd"/>
+        <w:t>1 - Ultra Fast, 2 - Fast, 3 - Fast, 4 - Normal, 5 - Normal, 6 - Slow</w:t>
+      </w:r>
       <w:r>
         <w:rPr>
           <w:sz w:val="28"/>
@@ -999,6 +870,45 @@
     </w:p>
     <w:p>
       <w:pPr>
+        <w:ind w:left="360"/>
+        <w:rPr>
+          <w:b/>
+          <w:color w:val="EE0000"/>
+          <w:sz w:val="32"/>
+          <w:szCs w:val="32"/>
+        </w:rPr>
+      </w:pPr>
+      <w:r>
+        <w:rPr>
+          <w:b/>
+          <w:color w:val="EE0000"/>
+          <w:sz w:val="32"/>
+          <w:szCs w:val="32"/>
+        </w:rPr>
+        <w:t>FONTOS!</w:t>
+      </w:r>
+      <w:r>
+        <w:rPr>
+          <w:b/>
+          <w:color w:val="EE0000"/>
+          <w:sz w:val="32"/>
+          <w:szCs w:val="32"/>
+        </w:rPr>
+        <w:t xml:space="preserve"> A bemeneteknek idősorrendben kell történniük, korábbi töltést a program nem tud inicializálni, ha azonos portra </w:t>
+      </w:r>
+      <w:r>
+        <w:rPr>
+          <w:b/>
+          <w:color w:val="EE0000"/>
+          <w:sz w:val="32"/>
+          <w:szCs w:val="32"/>
+        </w:rPr>
+        <w:lastRenderedPageBreak/>
+        <w:t>irányul, és a port egyszerre lesz elfoglalva két jármű által az adott időintervallumban!</w:t>
+      </w:r>
+    </w:p>
+    <w:p>
+      <w:pPr>
         <w:pStyle w:val="Listaszerbekezds"/>
         <w:numPr>
           <w:ilvl w:val="0"/>
@@ -1138,9 +1048,8 @@
         <w:rPr>
           <w:noProof/>
         </w:rPr>
-        <w:lastRenderedPageBreak/>
         <w:drawing>
-          <wp:anchor distT="0" distB="0" distL="114300" distR="114300" simplePos="0" relativeHeight="251658240" behindDoc="0" locked="0" layoutInCell="1" allowOverlap="1" wp14:anchorId="3D6BAED6">
+          <wp:anchor distT="0" distB="0" distL="114300" distR="114300" simplePos="0" relativeHeight="251658240" behindDoc="0" locked="0" layoutInCell="1" allowOverlap="1" wp14:anchorId="78651FB8" wp14:editId="5A7EC483">
             <wp:simplePos x="0" y="0"/>
             <wp:positionH relativeFrom="margin">
               <wp:posOffset>3966210</wp:posOffset>
@@ -1231,25 +1140,7 @@
           <w:sz w:val="28"/>
           <w:szCs w:val="28"/>
         </w:rPr>
-        <w:t>„</w:t>
-      </w:r>
-      <w:proofErr w:type="spellStart"/>
-      <w:r>
-        <w:rPr>
-          <w:i/>
-          <w:sz w:val="28"/>
-          <w:szCs w:val="28"/>
-        </w:rPr>
-        <w:t>exit</w:t>
-      </w:r>
-      <w:proofErr w:type="spellEnd"/>
-      <w:r>
-        <w:rPr>
-          <w:i/>
-          <w:sz w:val="28"/>
-          <w:szCs w:val="28"/>
-        </w:rPr>
-        <w:t>”</w:t>
+        <w:t>„exit”</w:t>
       </w:r>
       <w:r>
         <w:rPr>
@@ -1381,8 +1272,6 @@
         </w:rPr>
         <w:t xml:space="preserve"> a</w:t>
       </w:r>
-      <w:bookmarkStart w:id="1" w:name="_GoBack"/>
-      <w:bookmarkEnd w:id="1"/>
       <w:r>
         <w:rPr>
           <w:noProof/>
@@ -1446,15 +1335,7 @@
           <w:sz w:val="28"/>
           <w:szCs w:val="28"/>
         </w:rPr>
-        <w:t>amikor a fizetésre kerül a sor</w:t>
-      </w:r>
-      <w:r>
-        <w:rPr>
-          <w:noProof/>
-          <w:sz w:val="28"/>
-          <w:szCs w:val="28"/>
-        </w:rPr>
-        <w:t>, a</w:t>
+        <w:t>amikor a fizetésre kerül a sor, a</w:t>
       </w:r>
       <w:r>
         <w:rPr>
@@ -1485,7 +1366,7 @@
 </file>
 
 <file path=word/numbering.xml><?xml version="1.0" encoding="utf-8"?>
-<w:numbering xmlns:wpc="http://schemas.microsoft.com/office/word/2010/wordprocessingCanvas" xmlns:cx="http://schemas.microsoft.com/office/drawing/2014/chartex" xmlns:cx1="http://schemas.microsoft.com/office/drawing/2015/9/8/chartex" xmlns:cx2="http://schemas.microsoft.com/office/drawing/2015/10/21/chartex" xmlns:cx3="http://schemas.microsoft.com/office/drawing/2016/5/9/chartex" xmlns:cx4="http://schemas.microsoft.com/office/drawing/2016/5/10/chartex" xmlns:cx5="http://schemas.microsoft.com/office/drawing/2016/5/11/chartex" xmlns:cx6="http://schemas.microsoft.com/office/drawing/2016/5/12/chartex" xmlns:cx7="http://schemas.microsoft.com/office/drawing/2016/5/13/chartex" xmlns:cx8="http://schemas.microsoft.com/office/drawing/2016/5/14/chartex" xmlns:mc="http://schemas.openxmlformats.org/markup-compatibility/2006" xmlns:aink="http://schemas.microsoft.com/office/drawing/2016/ink" xmlns:am3d="http://schemas.microsoft.com/office/drawing/2017/model3d" xmlns:o="urn:schemas-microsoft-com:office:office" xmlns:r="http://schemas.openxmlformats.org/officeDocument/2006/relationships" xmlns:m="http://schemas.openxmlformats.org/officeDocument/2006/math" xmlns:v="urn:schemas-microsoft-com:vml" xmlns:wp14="http://schemas.microsoft.com/office/word/2010/wordprocessingDrawing" xmlns:wp="http://schemas.openxmlformats.org/drawingml/2006/wordprocessingDrawing" xmlns:w10="urn:schemas-microsoft-com:office:word" xmlns:w="http://schemas.openxmlformats.org/wordprocessingml/2006/main" xmlns:w14="http://schemas.microsoft.com/office/word/2010/wordml" xmlns:w15="http://schemas.microsoft.com/office/word/2012/wordml" xmlns:w16cid="http://schemas.microsoft.com/office/word/2016/wordml/cid" xmlns:w16se="http://schemas.microsoft.com/office/word/2015/wordml/symex" xmlns:wpg="http://schemas.microsoft.com/office/word/2010/wordprocessingGroup" xmlns:wpi="http://schemas.microsoft.com/office/word/2010/wordprocessingInk" xmlns:wne="http://schemas.microsoft.com/office/word/2006/wordml" xmlns:wps="http://schemas.microsoft.com/office/word/2010/wordprocessingShape" mc:Ignorable="w14 w15 w16se w16cid wp14">
+<w:numbering xmlns:wpc="http://schemas.microsoft.com/office/word/2010/wordprocessingCanvas" xmlns:cx="http://schemas.microsoft.com/office/drawing/2014/chartex" xmlns:cx1="http://schemas.microsoft.com/office/drawing/2015/9/8/chartex" xmlns:cx2="http://schemas.microsoft.com/office/drawing/2015/10/21/chartex" xmlns:cx3="http://schemas.microsoft.com/office/drawing/2016/5/9/chartex" xmlns:cx4="http://schemas.microsoft.com/office/drawing/2016/5/10/chartex" xmlns:cx5="http://schemas.microsoft.com/office/drawing/2016/5/11/chartex" xmlns:cx6="http://schemas.microsoft.com/office/drawing/2016/5/12/chartex" xmlns:cx7="http://schemas.microsoft.com/office/drawing/2016/5/13/chartex" xmlns:cx8="http://schemas.microsoft.com/office/drawing/2016/5/14/chartex" xmlns:mc="http://schemas.openxmlformats.org/markup-compatibility/2006" xmlns:aink="http://schemas.microsoft.com/office/drawing/2016/ink" xmlns:am3d="http://schemas.microsoft.com/office/drawing/2017/model3d" xmlns:o="urn:schemas-microsoft-com:office:office" xmlns:oel="http://schemas.microsoft.com/office/2019/extlst" xmlns:r="http://schemas.openxmlformats.org/officeDocument/2006/relationships" xmlns:m="http://schemas.openxmlformats.org/officeDocument/2006/math" xmlns:v="urn:schemas-microsoft-com:vml" xmlns:wp14="http://schemas.microsoft.com/office/word/2010/wordprocessingDrawing" xmlns:wp="http://schemas.openxmlformats.org/drawingml/2006/wordprocessingDrawing" xmlns:w10="urn:schemas-microsoft-com:office:word" xmlns:w="http://schemas.openxmlformats.org/wordprocessingml/2006/main" xmlns:w14="http://schemas.microsoft.com/office/word/2010/wordml" xmlns:w15="http://schemas.microsoft.com/office/word/2012/wordml" xmlns:w16cex="http://schemas.microsoft.com/office/word/2018/wordml/cex" xmlns:w16cid="http://schemas.microsoft.com/office/word/2016/wordml/cid" xmlns:w16="http://schemas.microsoft.com/office/word/2018/wordml" xmlns:w16du="http://schemas.microsoft.com/office/word/2023/wordml/word16du" xmlns:w16sdtdh="http://schemas.microsoft.com/office/word/2020/wordml/sdtdatahash" xmlns:w16sdtfl="http://schemas.microsoft.com/office/word/2024/wordml/sdtformatlock" xmlns:w16se="http://schemas.microsoft.com/office/word/2015/wordml/symex" xmlns:wpg="http://schemas.microsoft.com/office/word/2010/wordprocessingGroup" xmlns:wpi="http://schemas.microsoft.com/office/word/2010/wordprocessingInk" xmlns:wne="http://schemas.microsoft.com/office/word/2006/wordml" xmlns:wps="http://schemas.microsoft.com/office/word/2010/wordprocessingShape" mc:Ignorable="w14 w15 w16se w16cid w16 w16cex w16sdtdh w16sdtfl w16du wp14">
   <w:abstractNum w:abstractNumId="0" w15:restartNumberingAfterBreak="0">
     <w:nsid w:val="23B62DDB"/>
     <w:multiLevelType w:val="hybridMultilevel"/>
@@ -1825,23 +1706,23 @@
       </w:rPr>
     </w:lvl>
   </w:abstractNum>
-  <w:num w:numId="1">
+  <w:num w:numId="1" w16cid:durableId="524636358">
     <w:abstractNumId w:val="1"/>
   </w:num>
-  <w:num w:numId="2">
+  <w:num w:numId="2" w16cid:durableId="321472881">
     <w:abstractNumId w:val="1"/>
   </w:num>
-  <w:num w:numId="3">
+  <w:num w:numId="3" w16cid:durableId="282077015">
     <w:abstractNumId w:val="0"/>
   </w:num>
-  <w:num w:numId="4">
+  <w:num w:numId="4" w16cid:durableId="1985111913">
     <w:abstractNumId w:val="2"/>
   </w:num>
 </w:numbering>
 </file>
 
 <file path=word/styles.xml><?xml version="1.0" encoding="utf-8"?>
-<w:styles xmlns:mc="http://schemas.openxmlformats.org/markup-compatibility/2006" xmlns:r="http://schemas.openxmlformats.org/officeDocument/2006/relationships" xmlns:w="http://schemas.openxmlformats.org/wordprocessingml/2006/main" xmlns:w14="http://schemas.microsoft.com/office/word/2010/wordml" xmlns:w15="http://schemas.microsoft.com/office/word/2012/wordml" xmlns:w16cid="http://schemas.microsoft.com/office/word/2016/wordml/cid" xmlns:w16se="http://schemas.microsoft.com/office/word/2015/wordml/symex" mc:Ignorable="w14 w15 w16se w16cid">
+<w:styles xmlns:mc="http://schemas.openxmlformats.org/markup-compatibility/2006" xmlns:r="http://schemas.openxmlformats.org/officeDocument/2006/relationships" xmlns:w="http://schemas.openxmlformats.org/wordprocessingml/2006/main" xmlns:w14="http://schemas.microsoft.com/office/word/2010/wordml" xmlns:w15="http://schemas.microsoft.com/office/word/2012/wordml" xmlns:w16cex="http://schemas.microsoft.com/office/word/2018/wordml/cex" xmlns:w16cid="http://schemas.microsoft.com/office/word/2016/wordml/cid" xmlns:w16="http://schemas.microsoft.com/office/word/2018/wordml" xmlns:w16du="http://schemas.microsoft.com/office/word/2023/wordml/word16du" xmlns:w16sdtdh="http://schemas.microsoft.com/office/word/2020/wordml/sdtdatahash" xmlns:w16sdtfl="http://schemas.microsoft.com/office/word/2024/wordml/sdtformatlock" xmlns:w16se="http://schemas.microsoft.com/office/word/2015/wordml/symex" mc:Ignorable="w14 w15 w16se w16cid w16 w16cex w16sdtdh w16sdtfl w16du">
   <w:docDefaults>
     <w:rPrDefault>
       <w:rPr>
@@ -1857,7 +1738,7 @@
       </w:pPr>
     </w:pPrDefault>
   </w:docDefaults>
-  <w:latentStyles w:defLockedState="0" w:defUIPriority="99" w:defSemiHidden="0" w:defUnhideWhenUsed="0" w:defQFormat="0" w:count="375">
+  <w:latentStyles w:defLockedState="0" w:defUIPriority="99" w:defSemiHidden="0" w:defUnhideWhenUsed="0" w:defQFormat="0" w:count="376">
     <w:lsdException w:name="Normal" w:uiPriority="0" w:qFormat="1"/>
     <w:lsdException w:name="heading 1" w:uiPriority="9" w:qFormat="1"/>
     <w:lsdException w:name="heading 2" w:semiHidden="1" w:uiPriority="9" w:unhideWhenUsed="1" w:qFormat="1"/>
@@ -2233,6 +2114,7 @@
     <w:lsdException w:name="Smart Hyperlink" w:semiHidden="1" w:unhideWhenUsed="1"/>
     <w:lsdException w:name="Hashtag" w:semiHidden="1" w:unhideWhenUsed="1"/>
     <w:lsdException w:name="Unresolved Mention" w:semiHidden="1" w:unhideWhenUsed="1"/>
+    <w:lsdException w:name="Smart Link" w:semiHidden="1" w:unhideWhenUsed="1"/>
   </w:latentStyles>
   <w:style w:type="paragraph" w:default="1" w:styleId="Norml">
     <w:name w:val="Normal"/>

</xml_diff>